<commit_message>
test(harness): re-capture T5/insert golden after T7 insert-placement fix
T5 (T1.C(1,0)..P2@mid, Insert) is re-captured on build .10: the response now lands
at the END OF THE SELECTION (P2@mid, splitting Outro) — matching its long-stated
expected_insert ('après la fin de sélection') — instead of the pre-fix behavior
that wrongly inserted it after the table (the .7 golden was stale on this axis).
docElementOrder [Intro, T1, Outro-head, clone(GG/DD), Tail edit, Outro-tail];
after.docx order confirmed. cases.csv note updated; matrices regenerated.
</commit_message>
<xml_diff>
--- a/test-harness/corpus/T5/insert/after.docx
+++ b/test-harness/corpus/T5/insert/after.docx
@@ -122,6 +122,18 @@
         </w:tc>
       </w:tr>
     </w:tbl>
+    <w:p>
+      <w:pPr>
+        <w:pBdr/>
+        <w:spacing/>
+        <w:ind/>
+        <w:rPr/>
+      </w:pPr>
+      <w:r>
+        <w:t xml:space="preserve">Outro p</w:t>
+      </w:r>
+      <w:r/>
+    </w:p>
     <w:tbl>
       <w:tblPr>
         <w:tblStyle w:val="12"/>
@@ -233,8 +245,9 @@
         <w:rPr/>
       </w:pPr>
       <w:r>
-        <w:t xml:space="preserve">Outro paragraph</w:t>
+        <w:t xml:space="preserve">aragraph</w:t>
       </w:r>
+      <w:r/>
       <w:r/>
     </w:p>
     <w:sectPr>

</xml_diff>